<commit_message>
updated uml locations in report
</commit_message>
<xml_diff>
--- a/report/Stage1.docx
+++ b/report/Stage1.docx
@@ -1220,7 +1220,23 @@
           <w:sz w:val="22"/>
           <w:szCs w:val="22"/>
         </w:rPr>
-        <w:t xml:space="preserve"> own LLMClient interface, so another provider (</w:t>
+        <w:t xml:space="preserve"> own </w:t>
+      </w:r>
+      <w:proofErr w:type="spellStart"/>
+      <w:r>
+        <w:rPr>
+          <w:sz w:val="22"/>
+          <w:szCs w:val="22"/>
+        </w:rPr>
+        <w:t>LLMClient</w:t>
+      </w:r>
+      <w:proofErr w:type="spellEnd"/>
+      <w:r>
+        <w:rPr>
+          <w:sz w:val="22"/>
+          <w:szCs w:val="22"/>
+        </w:rPr>
+        <w:t xml:space="preserve"> interface, so another provider (</w:t>
       </w:r>
       <w:r>
         <w:rPr>
@@ -3459,11 +3475,32 @@
         </w:rPr>
         <w:t xml:space="preserve">See </w:t>
       </w:r>
+      <w:r>
+        <w:rPr>
+          <w:sz w:val="22"/>
+          <w:szCs w:val="22"/>
+        </w:rPr>
+        <w:t>/</w:t>
+      </w:r>
       <w:proofErr w:type="spellStart"/>
       <w:r>
         <w:rPr>
-          <w:i/>
-          <w:iCs/>
+          <w:sz w:val="22"/>
+          <w:szCs w:val="22"/>
+        </w:rPr>
+        <w:t>uml</w:t>
+      </w:r>
+      <w:proofErr w:type="spellEnd"/>
+      <w:r>
+        <w:rPr>
+          <w:sz w:val="22"/>
+          <w:szCs w:val="22"/>
+        </w:rPr>
+        <w:t>/</w:t>
+      </w:r>
+      <w:proofErr w:type="spellStart"/>
+      <w:r>
+        <w:rPr>
           <w:sz w:val="22"/>
           <w:szCs w:val="22"/>
         </w:rPr>
@@ -3475,7 +3512,14 @@
           <w:sz w:val="22"/>
           <w:szCs w:val="22"/>
         </w:rPr>
-        <w:t xml:space="preserve"> in /res folder.</w:t>
+        <w:t>.</w:t>
+      </w:r>
+      <w:r>
+        <w:rPr>
+          <w:sz w:val="22"/>
+          <w:szCs w:val="22"/>
+        </w:rPr>
+        <w:t xml:space="preserve"> </w:t>
       </w:r>
     </w:p>
     <w:p>
@@ -3577,21 +3621,7 @@
           <w:sz w:val="22"/>
           <w:szCs w:val="22"/>
         </w:rPr>
-        <w:t xml:space="preserve"> </w:t>
-      </w:r>
-      <w:r>
-        <w:rPr>
-          <w:sz w:val="22"/>
-          <w:szCs w:val="22"/>
-        </w:rPr>
-        <w:t>→</w:t>
-      </w:r>
-      <w:r>
-        <w:rPr>
-          <w:sz w:val="22"/>
-          <w:szCs w:val="22"/>
-        </w:rPr>
-        <w:t xml:space="preserve"> the fa</w:t>
+        <w:t xml:space="preserve"> → the fa</w:t>
       </w:r>
       <w:r>
         <w:rPr>
@@ -3667,14 +3697,7 @@
           <w:sz w:val="22"/>
           <w:szCs w:val="22"/>
         </w:rPr>
-        <w:t xml:space="preserve"> </w:t>
-      </w:r>
-      <w:r>
-        <w:rPr>
-          <w:sz w:val="22"/>
-          <w:szCs w:val="22"/>
-        </w:rPr>
-        <w:t>→</w:t>
+        <w:t xml:space="preserve"> →</w:t>
       </w:r>
       <w:r>
         <w:rPr>
@@ -3773,14 +3796,7 @@
           <w:sz w:val="22"/>
           <w:szCs w:val="22"/>
         </w:rPr>
-        <w:t xml:space="preserve"> </w:t>
-      </w:r>
-      <w:r>
-        <w:rPr>
-          <w:sz w:val="22"/>
-          <w:szCs w:val="22"/>
-        </w:rPr>
-        <w:t>→</w:t>
+        <w:t xml:space="preserve"> →</w:t>
       </w:r>
       <w:r>
         <w:rPr>
@@ -3840,14 +3856,7 @@
           <w:sz w:val="22"/>
           <w:szCs w:val="22"/>
         </w:rPr>
-        <w:t xml:space="preserve"> </w:t>
-      </w:r>
-      <w:r>
-        <w:rPr>
-          <w:sz w:val="22"/>
-          <w:szCs w:val="22"/>
-        </w:rPr>
-        <w:t>→</w:t>
+        <w:t xml:space="preserve"> →</w:t>
       </w:r>
       <w:r>
         <w:rPr>
@@ -3870,7 +3879,23 @@
           <w:sz w:val="22"/>
           <w:szCs w:val="22"/>
         </w:rPr>
-        <w:t xml:space="preserve"> and FakeLLMClient.</w:t>
+        <w:t xml:space="preserve"> and </w:t>
+      </w:r>
+      <w:proofErr w:type="spellStart"/>
+      <w:r>
+        <w:rPr>
+          <w:sz w:val="22"/>
+          <w:szCs w:val="22"/>
+        </w:rPr>
+        <w:t>FakeLLMClient</w:t>
+      </w:r>
+      <w:proofErr w:type="spellEnd"/>
+      <w:r>
+        <w:rPr>
+          <w:sz w:val="22"/>
+          <w:szCs w:val="22"/>
+        </w:rPr>
+        <w:t>.</w:t>
       </w:r>
     </w:p>
     <w:p>
@@ -3900,14 +3925,7 @@
           <w:sz w:val="22"/>
           <w:szCs w:val="22"/>
         </w:rPr>
-        <w:t xml:space="preserve"> </w:t>
-      </w:r>
-      <w:r>
-        <w:rPr>
-          <w:sz w:val="22"/>
-          <w:szCs w:val="22"/>
-        </w:rPr>
-        <w:t>→</w:t>
+        <w:t xml:space="preserve"> →</w:t>
       </w:r>
       <w:r>
         <w:rPr>
@@ -3977,14 +3995,7 @@
           <w:sz w:val="22"/>
           <w:szCs w:val="22"/>
         </w:rPr>
-        <w:t xml:space="preserve"> </w:t>
-      </w:r>
-      <w:r>
-        <w:rPr>
-          <w:sz w:val="22"/>
-          <w:szCs w:val="22"/>
-        </w:rPr>
-        <w:t>→</w:t>
+        <w:t xml:space="preserve"> →</w:t>
       </w:r>
       <w:r>
         <w:rPr>
@@ -4051,14 +4062,7 @@
           <w:sz w:val="22"/>
           <w:szCs w:val="22"/>
         </w:rPr>
-        <w:t xml:space="preserve"> </w:t>
-      </w:r>
-      <w:r>
-        <w:rPr>
-          <w:sz w:val="22"/>
-          <w:szCs w:val="22"/>
-        </w:rPr>
-        <w:t>→</w:t>
+        <w:t xml:space="preserve"> →</w:t>
       </w:r>
       <w:r>
         <w:rPr>
@@ -4081,21 +4085,7 @@
           <w:sz w:val="22"/>
           <w:szCs w:val="22"/>
         </w:rPr>
-        <w:t>Several behaviours have interchangeable algorithms</w:t>
-      </w:r>
-      <w:r>
-        <w:rPr>
-          <w:sz w:val="22"/>
-          <w:szCs w:val="22"/>
-        </w:rPr>
-        <w:t xml:space="preserve"> (e.g. which model generates text, how passages are retrieved, how an answer is graded). </w:t>
-      </w:r>
-      <w:r>
-        <w:rPr>
-          <w:sz w:val="22"/>
-          <w:szCs w:val="22"/>
-        </w:rPr>
-        <w:t>Callers depend only on the interface, so switching provider, retrieval method or question type means adding a class rather than editing conditionals in every service. It also makes unit tests deterministic, because the fake client and keyword retriever can be swapped in.</w:t>
+        <w:t>Several behaviours have interchangeable algorithms (e.g. which model generates text, how passages are retrieved, how an answer is graded). Callers depend only on the interface, so switching provider, retrieval method or question type means adding a class rather than editing conditionals in every service. It also makes unit tests deterministic, because the fake client and keyword retriever can be swapped in.</w:t>
       </w:r>
     </w:p>
     <w:p>
@@ -4132,14 +4122,7 @@
           <w:sz w:val="22"/>
           <w:szCs w:val="22"/>
         </w:rPr>
-        <w:t xml:space="preserve"> </w:t>
-      </w:r>
-      <w:r>
-        <w:rPr>
-          <w:sz w:val="22"/>
-          <w:szCs w:val="22"/>
-        </w:rPr>
-        <w:t>→</w:t>
+        <w:t xml:space="preserve"> →</w:t>
       </w:r>
       <w:r>
         <w:rPr>
@@ -4176,14 +4159,7 @@
           <w:sz w:val="22"/>
           <w:szCs w:val="22"/>
         </w:rPr>
-        <w:t xml:space="preserve"> </w:t>
-      </w:r>
-      <w:r>
-        <w:rPr>
-          <w:sz w:val="22"/>
-          <w:szCs w:val="22"/>
-        </w:rPr>
-        <w:t>→</w:t>
+        <w:t xml:space="preserve"> →</w:t>
       </w:r>
       <w:r>
         <w:rPr>
@@ -4227,14 +4203,7 @@
           <w:sz w:val="22"/>
           <w:szCs w:val="22"/>
         </w:rPr>
-        <w:t xml:space="preserve"> </w:t>
-      </w:r>
-      <w:r>
-        <w:rPr>
-          <w:sz w:val="22"/>
-          <w:szCs w:val="22"/>
-        </w:rPr>
-        <w:t>→</w:t>
+        <w:t xml:space="preserve"> →</w:t>
       </w:r>
       <w:r>
         <w:rPr>
@@ -4285,14 +4254,7 @@
           <w:sz w:val="22"/>
           <w:szCs w:val="22"/>
         </w:rPr>
-        <w:t xml:space="preserve"> </w:t>
-      </w:r>
-      <w:r>
-        <w:rPr>
-          <w:sz w:val="22"/>
-          <w:szCs w:val="22"/>
-        </w:rPr>
-        <w:t>→</w:t>
+        <w:t xml:space="preserve"> →</w:t>
       </w:r>
       <w:r>
         <w:rPr>
@@ -4391,14 +4353,7 @@
           <w:sz w:val="22"/>
           <w:szCs w:val="22"/>
         </w:rPr>
-        <w:t xml:space="preserve"> </w:t>
-      </w:r>
-      <w:r>
-        <w:rPr>
-          <w:sz w:val="22"/>
-          <w:szCs w:val="22"/>
-        </w:rPr>
-        <w:t>→</w:t>
+        <w:t xml:space="preserve"> →</w:t>
       </w:r>
       <w:r>
         <w:rPr>
@@ -4481,14 +4436,7 @@
           <w:sz w:val="22"/>
           <w:szCs w:val="22"/>
         </w:rPr>
-        <w:t xml:space="preserve"> </w:t>
-      </w:r>
-      <w:r>
-        <w:rPr>
-          <w:sz w:val="22"/>
-          <w:szCs w:val="22"/>
-        </w:rPr>
-        <w:t>→</w:t>
+        <w:t xml:space="preserve"> →</w:t>
       </w:r>
       <w:r>
         <w:rPr>
@@ -4523,14 +4471,7 @@
           <w:sz w:val="22"/>
           <w:szCs w:val="22"/>
         </w:rPr>
-        <w:t xml:space="preserve"> </w:t>
-      </w:r>
-      <w:r>
-        <w:rPr>
-          <w:sz w:val="22"/>
-          <w:szCs w:val="22"/>
-        </w:rPr>
-        <w:t>→</w:t>
+        <w:t xml:space="preserve"> →</w:t>
       </w:r>
       <w:r>
         <w:rPr>
@@ -4565,14 +4506,7 @@
           <w:sz w:val="22"/>
           <w:szCs w:val="22"/>
         </w:rPr>
-        <w:t xml:space="preserve"> </w:t>
-      </w:r>
-      <w:r>
-        <w:rPr>
-          <w:sz w:val="22"/>
-          <w:szCs w:val="22"/>
-        </w:rPr>
-        <w:t>→</w:t>
+        <w:t xml:space="preserve"> →</w:t>
       </w:r>
       <w:r>
         <w:rPr>
@@ -4607,14 +4541,7 @@
           <w:sz w:val="22"/>
           <w:szCs w:val="22"/>
         </w:rPr>
-        <w:t xml:space="preserve"> </w:t>
-      </w:r>
-      <w:r>
-        <w:rPr>
-          <w:sz w:val="22"/>
-          <w:szCs w:val="22"/>
-        </w:rPr>
-        <w:t>→</w:t>
+        <w:t xml:space="preserve"> →</w:t>
       </w:r>
       <w:r>
         <w:rPr>
@@ -4718,14 +4645,7 @@
           <w:sz w:val="22"/>
           <w:szCs w:val="22"/>
         </w:rPr>
-        <w:t xml:space="preserve"> </w:t>
-      </w:r>
-      <w:r>
-        <w:rPr>
-          <w:sz w:val="22"/>
-          <w:szCs w:val="22"/>
-        </w:rPr>
-        <w:t>→</w:t>
+        <w:t xml:space="preserve"> →</w:t>
       </w:r>
       <w:r>
         <w:rPr>
@@ -4762,14 +4682,7 @@
           <w:sz w:val="22"/>
           <w:szCs w:val="22"/>
         </w:rPr>
-        <w:t xml:space="preserve"> </w:t>
-      </w:r>
-      <w:r>
-        <w:rPr>
-          <w:sz w:val="22"/>
-          <w:szCs w:val="22"/>
-        </w:rPr>
-        <w:t>→</w:t>
+        <w:t xml:space="preserve"> →</w:t>
       </w:r>
       <w:r>
         <w:rPr>
@@ -4806,14 +4719,7 @@
           <w:sz w:val="22"/>
           <w:szCs w:val="22"/>
         </w:rPr>
-        <w:t xml:space="preserve"> </w:t>
-      </w:r>
-      <w:r>
-        <w:rPr>
-          <w:sz w:val="22"/>
-          <w:szCs w:val="22"/>
-        </w:rPr>
-        <w:t>→</w:t>
+        <w:t xml:space="preserve"> →</w:t>
       </w:r>
       <w:r>
         <w:rPr>
@@ -4848,14 +4754,7 @@
           <w:sz w:val="22"/>
           <w:szCs w:val="22"/>
         </w:rPr>
-        <w:t xml:space="preserve"> </w:t>
-      </w:r>
-      <w:r>
-        <w:rPr>
-          <w:sz w:val="22"/>
-          <w:szCs w:val="22"/>
-        </w:rPr>
-        <w:t>→</w:t>
+        <w:t xml:space="preserve"> →</w:t>
       </w:r>
       <w:r>
         <w:rPr>
@@ -4953,14 +4852,7 @@
           <w:sz w:val="22"/>
           <w:szCs w:val="22"/>
         </w:rPr>
-        <w:t xml:space="preserve"> </w:t>
-      </w:r>
-      <w:r>
-        <w:rPr>
-          <w:sz w:val="22"/>
-          <w:szCs w:val="22"/>
-        </w:rPr>
-        <w:t>→</w:t>
+        <w:t xml:space="preserve"> →</w:t>
       </w:r>
       <w:r>
         <w:rPr>
@@ -4997,14 +4889,7 @@
           <w:sz w:val="22"/>
           <w:szCs w:val="22"/>
         </w:rPr>
-        <w:t xml:space="preserve"> </w:t>
-      </w:r>
-      <w:r>
-        <w:rPr>
-          <w:sz w:val="22"/>
-          <w:szCs w:val="22"/>
-        </w:rPr>
-        <w:t>→</w:t>
+        <w:t xml:space="preserve"> →</w:t>
       </w:r>
       <w:r>
         <w:rPr>
@@ -5048,14 +4933,7 @@
           <w:sz w:val="22"/>
           <w:szCs w:val="22"/>
         </w:rPr>
-        <w:t xml:space="preserve"> </w:t>
-      </w:r>
-      <w:r>
-        <w:rPr>
-          <w:sz w:val="22"/>
-          <w:szCs w:val="22"/>
-        </w:rPr>
-        <w:t>→</w:t>
+        <w:t xml:space="preserve"> →</w:t>
       </w:r>
       <w:r>
         <w:rPr>
@@ -5187,14 +5065,7 @@
           <w:sz w:val="22"/>
           <w:szCs w:val="22"/>
         </w:rPr>
-        <w:t xml:space="preserve"> </w:t>
-      </w:r>
-      <w:r>
-        <w:rPr>
-          <w:sz w:val="22"/>
-          <w:szCs w:val="22"/>
-        </w:rPr>
-        <w:t>→</w:t>
+        <w:t xml:space="preserve"> →</w:t>
       </w:r>
       <w:r>
         <w:rPr>
@@ -5245,14 +5116,7 @@
           <w:sz w:val="22"/>
           <w:szCs w:val="22"/>
         </w:rPr>
-        <w:t xml:space="preserve"> </w:t>
-      </w:r>
-      <w:r>
-        <w:rPr>
-          <w:sz w:val="22"/>
-          <w:szCs w:val="22"/>
-        </w:rPr>
-        <w:t>→</w:t>
+        <w:t xml:space="preserve"> →</w:t>
       </w:r>
       <w:r>
         <w:rPr>
@@ -5321,14 +5185,7 @@
           <w:sz w:val="22"/>
           <w:szCs w:val="22"/>
         </w:rPr>
-        <w:t xml:space="preserve"> </w:t>
-      </w:r>
-      <w:r>
-        <w:rPr>
-          <w:sz w:val="22"/>
-          <w:szCs w:val="22"/>
-        </w:rPr>
-        <w:t>→</w:t>
+        <w:t xml:space="preserve"> →</w:t>
       </w:r>
       <w:r>
         <w:rPr>
@@ -5363,14 +5220,7 @@
           <w:sz w:val="22"/>
           <w:szCs w:val="22"/>
         </w:rPr>
-        <w:t xml:space="preserve"> </w:t>
-      </w:r>
-      <w:r>
-        <w:rPr>
-          <w:sz w:val="22"/>
-          <w:szCs w:val="22"/>
-        </w:rPr>
-        <w:t>→</w:t>
+        <w:t xml:space="preserve"> →</w:t>
       </w:r>
       <w:r>
         <w:rPr>
@@ -5415,13 +5265,7 @@
         <w:pStyle w:val="Heading2"/>
       </w:pPr>
       <w:r>
-        <w:t>UML</w:t>
-      </w:r>
-      <w:r>
-        <w:t xml:space="preserve"> Use-Case</w:t>
-      </w:r>
-      <w:r>
-        <w:t xml:space="preserve"> Diagram</w:t>
+        <w:t>UML Use-Case Diagram</w:t>
       </w:r>
     </w:p>
     <w:p>
@@ -5439,24 +5283,20 @@
         </w:rPr>
         <w:t xml:space="preserve">See </w:t>
       </w:r>
+      <w:r>
+        <w:rPr>
+          <w:sz w:val="22"/>
+          <w:szCs w:val="22"/>
+        </w:rPr>
+        <w:t>/</w:t>
+      </w:r>
       <w:proofErr w:type="spellStart"/>
       <w:r>
         <w:rPr>
-          <w:i/>
-          <w:iCs/>
-          <w:sz w:val="22"/>
-          <w:szCs w:val="22"/>
-        </w:rPr>
-        <w:t>UseCase</w:t>
-      </w:r>
-      <w:r>
-        <w:rPr>
-          <w:i/>
-          <w:iCs/>
-          <w:sz w:val="22"/>
-          <w:szCs w:val="22"/>
-        </w:rPr>
-        <w:t>Diagram.svg</w:t>
+          <w:sz w:val="22"/>
+          <w:szCs w:val="22"/>
+        </w:rPr>
+        <w:t>uml</w:t>
       </w:r>
       <w:proofErr w:type="spellEnd"/>
       <w:r>
@@ -5464,7 +5304,23 @@
           <w:sz w:val="22"/>
           <w:szCs w:val="22"/>
         </w:rPr>
-        <w:t xml:space="preserve"> in /res folder.</w:t>
+        <w:t>/</w:t>
+      </w:r>
+      <w:proofErr w:type="spellStart"/>
+      <w:r>
+        <w:rPr>
+          <w:sz w:val="22"/>
+          <w:szCs w:val="22"/>
+        </w:rPr>
+        <w:t>UseCaseDiagram.svg</w:t>
+      </w:r>
+      <w:proofErr w:type="spellEnd"/>
+      <w:r>
+        <w:rPr>
+          <w:sz w:val="22"/>
+          <w:szCs w:val="22"/>
+        </w:rPr>
+        <w:t>.</w:t>
       </w:r>
     </w:p>
     <w:p>
@@ -5472,10 +5328,7 @@
         <w:pStyle w:val="Heading2"/>
       </w:pPr>
       <w:r>
-        <w:t xml:space="preserve">Use-Case </w:t>
-      </w:r>
-      <w:r>
-        <w:t>Descriptions</w:t>
+        <w:t>Use-Case Descriptions</w:t>
       </w:r>
     </w:p>
     <w:p>
@@ -5484,13 +5337,7 @@
         <w:spacing w:before="140" w:after="40"/>
       </w:pPr>
       <w:r>
-        <w:t>UC01</w:t>
-      </w:r>
-      <w:r>
-        <w:t xml:space="preserve"> — </w:t>
-      </w:r>
-      <w:r>
-        <w:t>Manage Course Materials</w:t>
+        <w:t>UC01 — Manage Course Materials</w:t>
       </w:r>
     </w:p>
     <w:p>
@@ -7114,8 +6961,29 @@
       </w:r>
       <w:r>
         <w:rPr>
-          <w:i/>
-          <w:iCs/>
+          <w:sz w:val="22"/>
+          <w:szCs w:val="22"/>
+        </w:rPr>
+        <w:t>/</w:t>
+      </w:r>
+      <w:proofErr w:type="spellStart"/>
+      <w:r>
+        <w:rPr>
+          <w:sz w:val="22"/>
+          <w:szCs w:val="22"/>
+        </w:rPr>
+        <w:t>uml</w:t>
+      </w:r>
+      <w:proofErr w:type="spellEnd"/>
+      <w:r>
+        <w:rPr>
+          <w:sz w:val="22"/>
+          <w:szCs w:val="22"/>
+        </w:rPr>
+        <w:t>/</w:t>
+      </w:r>
+      <w:r>
+        <w:rPr>
           <w:sz w:val="22"/>
           <w:szCs w:val="22"/>
         </w:rPr>
@@ -7123,28 +6991,26 @@
       </w:r>
       <w:r>
         <w:rPr>
-          <w:i/>
-          <w:iCs/>
           <w:sz w:val="22"/>
           <w:szCs w:val="22"/>
         </w:rPr>
         <w:t>.</w:t>
       </w:r>
-      <w:r>
-        <w:rPr>
-          <w:i/>
-          <w:iCs/>
+      <w:proofErr w:type="spellStart"/>
+      <w:r>
+        <w:rPr>
           <w:sz w:val="22"/>
           <w:szCs w:val="22"/>
         </w:rPr>
         <w:t>png</w:t>
       </w:r>
-      <w:r>
-        <w:rPr>
-          <w:sz w:val="22"/>
-          <w:szCs w:val="22"/>
-        </w:rPr>
-        <w:t xml:space="preserve"> in /res folder.</w:t>
+      <w:proofErr w:type="spellEnd"/>
+      <w:r>
+        <w:rPr>
+          <w:sz w:val="22"/>
+          <w:szCs w:val="22"/>
+        </w:rPr>
+        <w:t>.</w:t>
       </w:r>
     </w:p>
     <w:p>
@@ -8828,7 +8694,29 @@
                 <w:sz w:val="17"/>
                 <w:szCs w:val="17"/>
               </w:rPr>
-              <w:t xml:space="preserve">, LLMClient, </w:t>
+              <w:t xml:space="preserve">, </w:t>
+            </w:r>
+            <w:proofErr w:type="spellStart"/>
+            <w:r>
+              <w:rPr>
+                <w:rFonts w:ascii="Calibri" w:eastAsia="Calibri" w:hAnsi="Calibri" w:cs="Calibri"/>
+                <w:b w:val="0"/>
+                <w:bCs w:val="0"/>
+                <w:sz w:val="17"/>
+                <w:szCs w:val="17"/>
+              </w:rPr>
+              <w:t>LLMClient</w:t>
+            </w:r>
+            <w:proofErr w:type="spellEnd"/>
+            <w:r>
+              <w:rPr>
+                <w:rFonts w:ascii="Calibri" w:eastAsia="Calibri" w:hAnsi="Calibri" w:cs="Calibri"/>
+                <w:b w:val="0"/>
+                <w:bCs w:val="0"/>
+                <w:sz w:val="17"/>
+                <w:szCs w:val="17"/>
+              </w:rPr>
+              <w:t xml:space="preserve">, </w:t>
             </w:r>
             <w:proofErr w:type="spellStart"/>
             <w:r>
@@ -9130,7 +9018,25 @@
                 <w:sz w:val="17"/>
                 <w:szCs w:val="17"/>
               </w:rPr>
-              <w:t xml:space="preserve">, LLMClient, </w:t>
+              <w:t xml:space="preserve">, </w:t>
+            </w:r>
+            <w:proofErr w:type="spellStart"/>
+            <w:r>
+              <w:rPr>
+                <w:rFonts w:ascii="Calibri" w:eastAsia="Calibri" w:hAnsi="Calibri" w:cs="Calibri"/>
+                <w:sz w:val="17"/>
+                <w:szCs w:val="17"/>
+              </w:rPr>
+              <w:t>LLMClient</w:t>
+            </w:r>
+            <w:proofErr w:type="spellEnd"/>
+            <w:r>
+              <w:rPr>
+                <w:rFonts w:ascii="Calibri" w:eastAsia="Calibri" w:hAnsi="Calibri" w:cs="Calibri"/>
+                <w:sz w:val="17"/>
+                <w:szCs w:val="17"/>
+              </w:rPr>
+              <w:t xml:space="preserve">, </w:t>
             </w:r>
             <w:proofErr w:type="spellStart"/>
             <w:r>
@@ -10026,7 +9932,25 @@
                 <w:sz w:val="17"/>
                 <w:szCs w:val="17"/>
               </w:rPr>
-              <w:t xml:space="preserve">, MasteryService, LLMClient, StudyPlan, </w:t>
+              <w:t xml:space="preserve">, MasteryService, </w:t>
+            </w:r>
+            <w:proofErr w:type="spellStart"/>
+            <w:r>
+              <w:rPr>
+                <w:rFonts w:ascii="Calibri" w:eastAsia="Calibri" w:hAnsi="Calibri" w:cs="Calibri"/>
+                <w:sz w:val="17"/>
+                <w:szCs w:val="17"/>
+              </w:rPr>
+              <w:t>LLMClient</w:t>
+            </w:r>
+            <w:proofErr w:type="spellEnd"/>
+            <w:r>
+              <w:rPr>
+                <w:rFonts w:ascii="Calibri" w:eastAsia="Calibri" w:hAnsi="Calibri" w:cs="Calibri"/>
+                <w:sz w:val="17"/>
+                <w:szCs w:val="17"/>
+              </w:rPr>
+              <w:t xml:space="preserve">, StudyPlan, </w:t>
             </w:r>
             <w:proofErr w:type="spellStart"/>
             <w:r>
@@ -10288,7 +10212,25 @@
                 <w:sz w:val="17"/>
                 <w:szCs w:val="17"/>
               </w:rPr>
-              <w:t xml:space="preserve">, Planner, LLMClient, ToolManager, </w:t>
+              <w:t xml:space="preserve">, Planner, </w:t>
+            </w:r>
+            <w:proofErr w:type="spellStart"/>
+            <w:r>
+              <w:rPr>
+                <w:rFonts w:ascii="Calibri" w:eastAsia="Calibri" w:hAnsi="Calibri" w:cs="Calibri"/>
+                <w:sz w:val="17"/>
+                <w:szCs w:val="17"/>
+              </w:rPr>
+              <w:t>LLMClient</w:t>
+            </w:r>
+            <w:proofErr w:type="spellEnd"/>
+            <w:r>
+              <w:rPr>
+                <w:rFonts w:ascii="Calibri" w:eastAsia="Calibri" w:hAnsi="Calibri" w:cs="Calibri"/>
+                <w:sz w:val="17"/>
+                <w:szCs w:val="17"/>
+              </w:rPr>
+              <w:t xml:space="preserve">, ToolManager, </w:t>
             </w:r>
             <w:proofErr w:type="spellStart"/>
             <w:r>
@@ -16090,6 +16032,7 @@
   <w:style w:type="character" w:default="1" w:styleId="DefaultParagraphFont">
     <w:name w:val="Default Paragraph Font"/>
     <w:uiPriority w:val="1"/>
+    <w:semiHidden/>
     <w:unhideWhenUsed/>
   </w:style>
   <w:style w:type="table" w:default="1" w:styleId="TableNormal">
@@ -16859,8 +16802,10 @@
     <w:rsid w:val="000350B0"/>
     <w:rsid w:val="001D1928"/>
     <w:rsid w:val="001D6236"/>
+    <w:rsid w:val="003650E1"/>
     <w:rsid w:val="007455D3"/>
     <w:rsid w:val="0077767F"/>
+    <w:rsid w:val="008303C6"/>
     <w:rsid w:val="00B01064"/>
     <w:rsid w:val="00DC525E"/>
     <w:rsid w:val="00FB7335"/>

</xml_diff>